<commit_message>
feat: implement tour reviews feature with models, controllers, routes, and data import utilities
</commit_message>
<xml_diff>
--- a/Web_Security_Masterclass_Notes.docx
+++ b/Web_Security_Masterclass_Notes.docx
@@ -1026,6 +1026,1779 @@
         <w:spacing w:after="120"/>
       </w:pPr>
     </w:p>
+    <w:p>
+      <w:pPr>
+        <w:pStyle w:val="Heading1"/>
+        <w:spacing w:before="360" w:after="120"/>
+      </w:pPr>
+      <w:r>
+        <w:rPr>
+          <w:rFonts w:ascii="Calibri" w:hAnsi="Calibri"/>
+          <w:b/>
+          <w:color w:val="0284C7"/>
+          <w:sz w:val="32"/>
+        </w:rPr>
+        <w:t>10. Controller Factory Functions (Handler Factory Pattern)</w:t>
+      </w:r>
+    </w:p>
+    <w:p>
+      <w:pPr>
+        <w:spacing w:before="40" w:after="120" w:line="276" w:lineRule="auto"/>
+      </w:pPr>
+      <w:r>
+        <w:rPr>
+          <w:rFonts w:ascii="Calibri" w:hAnsi="Calibri"/>
+          <w:b/>
+          <w:color w:val="0F172A"/>
+          <w:sz w:val="22"/>
+        </w:rPr>
+        <w:t xml:space="preserve">Architectural Overview: </w:t>
+      </w:r>
+      <w:r>
+        <w:rPr>
+          <w:rFonts w:ascii="Calibri" w:hAnsi="Calibri"/>
+          <w:color w:val="334155"/>
+          <w:sz w:val="22"/>
+        </w:rPr>
+        <w:t>Building reusable controller factory functions (commonly called Handler Factory) is an architectural best-practice in Express/Mongoose applications. Instead of repeating 15–30 lines of boilerplate CRUD logic in every single controller file (e.g., Tour, Review, User, Booking), we create higher-order factory functions that dynamically produce Express route handlers for any given Mongoose model.</w:t>
+      </w:r>
+    </w:p>
+    <w:p>
+      <w:pPr>
+        <w:pStyle w:val="Heading2"/>
+        <w:spacing w:before="240" w:after="80"/>
+      </w:pPr>
+      <w:r>
+        <w:rPr>
+          <w:rFonts w:ascii="Calibri" w:hAnsi="Calibri"/>
+          <w:b/>
+          <w:color w:val="0F172A"/>
+          <w:sz w:val="26"/>
+        </w:rPr>
+        <w:t>Mental Model: Closures &amp; Higher-Order Functions</w:t>
+      </w:r>
+    </w:p>
+    <w:p>
+      <w:pPr>
+        <w:spacing w:before="40" w:after="120" w:line="276" w:lineRule="auto"/>
+      </w:pPr>
+      <w:r>
+        <w:rPr>
+          <w:rFonts w:ascii="Calibri" w:hAnsi="Calibri"/>
+          <w:b/>
+          <w:color w:val="0F172A"/>
+          <w:sz w:val="22"/>
+        </w:rPr>
+        <w:t xml:space="preserve">How Closures Power the Pattern: </w:t>
+      </w:r>
+      <w:r>
+        <w:rPr>
+          <w:rFonts w:ascii="Calibri" w:hAnsi="Calibri"/>
+          <w:color w:val="334155"/>
+          <w:sz w:val="22"/>
+        </w:rPr>
+        <w:t>In Express, every route handler is fundamentally a function with the signature (req, res, next) =&gt; { ... }.</w:t>
+        <w:br/>
+        <w:t>A Factory Function is a higher-order function that accepts a Mongoose Model (plus optional configuration like populate options) and returns the standard Express handler. Due to JavaScript Closures, the returned inner function retains lexical access to the specific Model passed into the outer function.</w:t>
+      </w:r>
+    </w:p>
+    <w:tbl>
+      <w:tblPr>
+        <w:tblW w:type="auto" w:w="0"/>
+        <w:jc w:val="center"/>
+        <w:tblLayout w:type="fixed"/>
+        <w:tblLook w:firstColumn="1" w:firstRow="1" w:lastColumn="0" w:lastRow="0" w:noHBand="0" w:noVBand="1" w:val="04A0"/>
+      </w:tblPr>
+      <w:tblGrid>
+        <w:gridCol w:w="9936"/>
+      </w:tblGrid>
+      <w:tr>
+        <w:tc>
+          <w:tcPr>
+            <w:tcW w:type="dxa" w:w="9360"/>
+            <w:shd w:fill="F4F6F8"/>
+            <w:tcMar>
+              <w:top w:w="140" w:type="dxa"/>
+              <w:bottom w:w="140" w:type="dxa"/>
+              <w:left w:w="220" w:type="dxa"/>
+              <w:right w:w="220" w:type="dxa"/>
+            </w:tcMar>
+            <w:tcBorders>
+              <w:top w:val="single" w:sz="4" w:space="0" w:color="CBD5E1"/>
+              <w:bottom w:val="single" w:sz="4" w:space="0" w:color="CBD5E1"/>
+              <w:left w:val="single" w:sz="24" w:space="0" w:color="0284C7"/>
+              <w:right w:val="single" w:sz="4" w:space="0" w:color="CBD5E1"/>
+            </w:tcBorders>
+          </w:tcPr>
+          <w:p>
+            <w:pPr>
+              <w:spacing w:before="60" w:after="60" w:line="276" w:lineRule="auto"/>
+            </w:pPr>
+            <w:r>
+              <w:rPr>
+                <w:rFonts w:ascii="Consolas" w:hAnsi="Consolas"/>
+                <w:color w:val="1E293B"/>
+                <w:sz w:val="19"/>
+              </w:rPr>
+              <w:t>+--------------------------------+</w:t>
+              <w:br/>
+            </w:r>
+            <w:r>
+              <w:rPr>
+                <w:rFonts w:ascii="Consolas" w:hAnsi="Consolas"/>
+                <w:color w:val="1E293B"/>
+                <w:sz w:val="19"/>
+              </w:rPr>
+              <w:t xml:space="preserve">       |        Factory Function        |  &lt;--- Input: Mongoose Model (Tour, Review, User)</w:t>
+              <w:br/>
+            </w:r>
+            <w:r>
+              <w:rPr>
+                <w:rFonts w:ascii="Consolas" w:hAnsi="Consolas"/>
+                <w:color w:val="1E293B"/>
+                <w:sz w:val="19"/>
+              </w:rPr>
+              <w:t xml:space="preserve">       +---------------+----------------+       &amp; optional options (e.g., popOptions)</w:t>
+              <w:br/>
+            </w:r>
+            <w:r>
+              <w:rPr>
+                <w:rFonts w:ascii="Consolas" w:hAnsi="Consolas"/>
+                <w:color w:val="1E293B"/>
+                <w:sz w:val="19"/>
+              </w:rPr>
+              <w:t xml:space="preserve">                       |</w:t>
+              <w:br/>
+            </w:r>
+            <w:r>
+              <w:rPr>
+                <w:rFonts w:ascii="Consolas" w:hAnsi="Consolas"/>
+                <w:color w:val="1E293B"/>
+                <w:sz w:val="19"/>
+              </w:rPr>
+              <w:t xml:space="preserve">                       v  (Returns Higher-Order Function)</w:t>
+              <w:br/>
+            </w:r>
+            <w:r>
+              <w:rPr>
+                <w:rFonts w:ascii="Consolas" w:hAnsi="Consolas"/>
+                <w:color w:val="1E293B"/>
+                <w:sz w:val="19"/>
+              </w:rPr>
+              <w:t xml:space="preserve">       +---------------+----------------+</w:t>
+              <w:br/>
+            </w:r>
+            <w:r>
+              <w:rPr>
+                <w:rFonts w:ascii="Consolas" w:hAnsi="Consolas"/>
+                <w:color w:val="1E293B"/>
+                <w:sz w:val="19"/>
+              </w:rPr>
+              <w:t xml:space="preserve">       |     Express Route Handler      |  &lt;--- (req, res, next) =&gt; { ... }</w:t>
+              <w:br/>
+            </w:r>
+            <w:r>
+              <w:rPr>
+                <w:rFonts w:ascii="Consolas" w:hAnsi="Consolas"/>
+                <w:color w:val="1E293B"/>
+                <w:sz w:val="19"/>
+              </w:rPr>
+              <w:t xml:space="preserve">       |   (Closure retains Model ref)  |       Executes standardized CRUD operations</w:t>
+              <w:br/>
+            </w:r>
+            <w:r>
+              <w:rPr>
+                <w:rFonts w:ascii="Consolas" w:hAnsi="Consolas"/>
+                <w:color w:val="1E293B"/>
+                <w:sz w:val="19"/>
+              </w:rPr>
+              <w:t xml:space="preserve">       +--------------------------------+</w:t>
+            </w:r>
+          </w:p>
+        </w:tc>
+      </w:tr>
+    </w:tbl>
+    <w:p>
+      <w:pPr>
+        <w:spacing w:before="40" w:after="120"/>
+      </w:pPr>
+    </w:p>
+    <w:p>
+      <w:pPr>
+        <w:pStyle w:val="Heading2"/>
+        <w:spacing w:before="240" w:after="80"/>
+      </w:pPr>
+      <w:r>
+        <w:rPr>
+          <w:rFonts w:ascii="Calibri" w:hAnsi="Calibri"/>
+          <w:b/>
+          <w:color w:val="0F172A"/>
+          <w:sz w:val="26"/>
+        </w:rPr>
+        <w:t>Granular Factory Functions vs. Single Monolithic Switch</w:t>
+      </w:r>
+    </w:p>
+    <w:p>
+      <w:pPr>
+        <w:spacing w:before="40" w:after="120" w:line="276" w:lineRule="auto"/>
+      </w:pPr>
+      <w:r>
+        <w:rPr>
+          <w:rFonts w:ascii="Calibri" w:hAnsi="Calibri"/>
+          <w:b/>
+          <w:color w:val="0F172A"/>
+          <w:sz w:val="22"/>
+        </w:rPr>
+        <w:t xml:space="preserve">Design Principle: </w:t>
+      </w:r>
+      <w:r>
+        <w:rPr>
+          <w:rFonts w:ascii="Calibri" w:hAnsi="Calibri"/>
+          <w:color w:val="334155"/>
+          <w:sz w:val="22"/>
+        </w:rPr>
+        <w:t>Rather than having a single gigantic function that accepts a string flag like 'getAll' or 'delete', modular architecture dictates exporting dedicated factory functions for each CRUD operation:</w:t>
+      </w:r>
+    </w:p>
+    <w:p>
+      <w:pPr>
+        <w:pStyle w:val="ListBullet"/>
+        <w:spacing w:before="40" w:after="80" w:line="276" w:lineRule="auto"/>
+      </w:pPr>
+      <w:r>
+        <w:rPr>
+          <w:rFonts w:ascii="Calibri" w:hAnsi="Calibri"/>
+          <w:b/>
+          <w:color w:val="0F172A"/>
+          <w:sz w:val="22"/>
+        </w:rPr>
+        <w:t xml:space="preserve">1. deleteOne(Model): </w:t>
+      </w:r>
+      <w:r>
+        <w:rPr>
+          <w:rFonts w:ascii="Calibri" w:hAnsi="Calibri"/>
+          <w:color w:val="334155"/>
+          <w:sz w:val="22"/>
+        </w:rPr>
+        <w:t>Handles findByIdAndDelete, 404 validation via AppError, and 204 No Content response.</w:t>
+      </w:r>
+    </w:p>
+    <w:p>
+      <w:pPr>
+        <w:pStyle w:val="ListBullet"/>
+        <w:spacing w:before="40" w:after="80" w:line="276" w:lineRule="auto"/>
+      </w:pPr>
+      <w:r>
+        <w:rPr>
+          <w:rFonts w:ascii="Calibri" w:hAnsi="Calibri"/>
+          <w:b/>
+          <w:color w:val="0F172A"/>
+          <w:sz w:val="22"/>
+        </w:rPr>
+        <w:t xml:space="preserve">2. updateOne(Model): </w:t>
+      </w:r>
+      <w:r>
+        <w:rPr>
+          <w:rFonts w:ascii="Calibri" w:hAnsi="Calibri"/>
+          <w:color w:val="334155"/>
+          <w:sz w:val="22"/>
+        </w:rPr>
+        <w:t>Handles findByIdAndUpdate with runValidators and new: true options.</w:t>
+      </w:r>
+    </w:p>
+    <w:p>
+      <w:pPr>
+        <w:pStyle w:val="ListBullet"/>
+        <w:spacing w:before="40" w:after="80" w:line="276" w:lineRule="auto"/>
+      </w:pPr>
+      <w:r>
+        <w:rPr>
+          <w:rFonts w:ascii="Calibri" w:hAnsi="Calibri"/>
+          <w:b/>
+          <w:color w:val="0F172A"/>
+          <w:sz w:val="22"/>
+        </w:rPr>
+        <w:t xml:space="preserve">3. createOne(Model): </w:t>
+      </w:r>
+      <w:r>
+        <w:rPr>
+          <w:rFonts w:ascii="Calibri" w:hAnsi="Calibri"/>
+          <w:color w:val="334155"/>
+          <w:sz w:val="22"/>
+        </w:rPr>
+        <w:t>Handles Model.create(req.body) and sends 201 Created.</w:t>
+      </w:r>
+    </w:p>
+    <w:p>
+      <w:pPr>
+        <w:pStyle w:val="ListBullet"/>
+        <w:spacing w:before="40" w:after="80" w:line="276" w:lineRule="auto"/>
+      </w:pPr>
+      <w:r>
+        <w:rPr>
+          <w:rFonts w:ascii="Calibri" w:hAnsi="Calibri"/>
+          <w:b/>
+          <w:color w:val="0F172A"/>
+          <w:sz w:val="22"/>
+        </w:rPr>
+        <w:t xml:space="preserve">4. getOne(Model, popOptions): </w:t>
+      </w:r>
+      <w:r>
+        <w:rPr>
+          <w:rFonts w:ascii="Calibri" w:hAnsi="Calibri"/>
+          <w:color w:val="334155"/>
+          <w:sz w:val="22"/>
+        </w:rPr>
+        <w:t>Handles findById with dynamic .populate() chaining when population options are supplied.</w:t>
+      </w:r>
+    </w:p>
+    <w:p>
+      <w:pPr>
+        <w:pStyle w:val="ListBullet"/>
+        <w:spacing w:before="40" w:after="80" w:line="276" w:lineRule="auto"/>
+      </w:pPr>
+      <w:r>
+        <w:rPr>
+          <w:rFonts w:ascii="Calibri" w:hAnsi="Calibri"/>
+          <w:b/>
+          <w:color w:val="0F172A"/>
+          <w:sz w:val="22"/>
+        </w:rPr>
+        <w:t xml:space="preserve">5. getAll(Model): </w:t>
+      </w:r>
+      <w:r>
+        <w:rPr>
+          <w:rFonts w:ascii="Calibri" w:hAnsi="Calibri"/>
+          <w:color w:val="334155"/>
+          <w:sz w:val="22"/>
+        </w:rPr>
+        <w:t>Integrates the APIFeatures class (filtering, sorting, field limiting, pagination) and automatically detects nested route parameters (e.g. /tours/:tourId/reviews).</w:t>
+      </w:r>
+    </w:p>
+    <w:p>
+      <w:pPr>
+        <w:pStyle w:val="Heading2"/>
+        <w:spacing w:before="240" w:after="80"/>
+      </w:pPr>
+      <w:r>
+        <w:rPr>
+          <w:rFonts w:ascii="Calibri" w:hAnsi="Calibri"/>
+          <w:b/>
+          <w:color w:val="0F172A"/>
+          <w:sz w:val="26"/>
+        </w:rPr>
+        <w:t>Complete Reference Implementation: controllers/handlerFactory.js</w:t>
+      </w:r>
+    </w:p>
+    <w:p>
+      <w:pPr>
+        <w:spacing w:before="40" w:after="120" w:line="276" w:lineRule="auto"/>
+      </w:pPr>
+      <w:r>
+        <w:rPr>
+          <w:rFonts w:ascii="Calibri" w:hAnsi="Calibri"/>
+          <w:b/>
+          <w:color w:val="0F172A"/>
+          <w:sz w:val="22"/>
+        </w:rPr>
+        <w:t xml:space="preserve">Source Code: </w:t>
+      </w:r>
+      <w:r>
+        <w:rPr>
+          <w:rFonts w:ascii="Calibri" w:hAnsi="Calibri"/>
+          <w:color w:val="334155"/>
+          <w:sz w:val="22"/>
+        </w:rPr>
+        <w:t>Below is the production-ready implementation of all 5 factory handlers wrapped with catchAsync error handling:</w:t>
+      </w:r>
+    </w:p>
+    <w:tbl>
+      <w:tblPr>
+        <w:tblW w:type="auto" w:w="0"/>
+        <w:jc w:val="center"/>
+        <w:tblLayout w:type="fixed"/>
+        <w:tblLook w:firstColumn="1" w:firstRow="1" w:lastColumn="0" w:lastRow="0" w:noHBand="0" w:noVBand="1" w:val="04A0"/>
+      </w:tblPr>
+      <w:tblGrid>
+        <w:gridCol w:w="9936"/>
+      </w:tblGrid>
+      <w:tr>
+        <w:tc>
+          <w:tcPr>
+            <w:tcW w:type="dxa" w:w="9360"/>
+            <w:shd w:fill="F4F6F8"/>
+            <w:tcMar>
+              <w:top w:w="140" w:type="dxa"/>
+              <w:bottom w:w="140" w:type="dxa"/>
+              <w:left w:w="220" w:type="dxa"/>
+              <w:right w:w="220" w:type="dxa"/>
+            </w:tcMar>
+            <w:tcBorders>
+              <w:top w:val="single" w:sz="4" w:space="0" w:color="CBD5E1"/>
+              <w:bottom w:val="single" w:sz="4" w:space="0" w:color="CBD5E1"/>
+              <w:left w:val="single" w:sz="24" w:space="0" w:color="0284C7"/>
+              <w:right w:val="single" w:sz="4" w:space="0" w:color="CBD5E1"/>
+            </w:tcBorders>
+          </w:tcPr>
+          <w:p>
+            <w:pPr>
+              <w:spacing w:before="60" w:after="60" w:line="276" w:lineRule="auto"/>
+            </w:pPr>
+            <w:r>
+              <w:rPr>
+                <w:rFonts w:ascii="Consolas" w:hAnsi="Consolas"/>
+                <w:color w:val="1E293B"/>
+                <w:sz w:val="19"/>
+              </w:rPr>
+              <w:t>const catchAsync = require('../utils/catchAsync');</w:t>
+              <w:br/>
+            </w:r>
+            <w:r>
+              <w:rPr>
+                <w:rFonts w:ascii="Consolas" w:hAnsi="Consolas"/>
+                <w:color w:val="1E293B"/>
+                <w:sz w:val="19"/>
+              </w:rPr>
+              <w:t>const AppError = require('../utils/AppError');</w:t>
+              <w:br/>
+            </w:r>
+            <w:r>
+              <w:rPr>
+                <w:rFonts w:ascii="Consolas" w:hAnsi="Consolas"/>
+                <w:color w:val="1E293B"/>
+                <w:sz w:val="19"/>
+              </w:rPr>
+              <w:t>const APIFeatures = require('../utils/ApiFeatures');</w:t>
+              <w:br/>
+            </w:r>
+            <w:r>
+              <w:rPr>
+                <w:rFonts w:ascii="Consolas" w:hAnsi="Consolas"/>
+                <w:color w:val="1E293B"/>
+                <w:sz w:val="19"/>
+              </w:rPr>
+              <w:br/>
+            </w:r>
+            <w:r>
+              <w:rPr>
+                <w:rFonts w:ascii="Consolas" w:hAnsi="Consolas"/>
+                <w:color w:val="1E293B"/>
+                <w:sz w:val="19"/>
+              </w:rPr>
+              <w:t>// 1. DELETE ONE FACTORY</w:t>
+              <w:br/>
+            </w:r>
+            <w:r>
+              <w:rPr>
+                <w:rFonts w:ascii="Consolas" w:hAnsi="Consolas"/>
+                <w:color w:val="1E293B"/>
+                <w:sz w:val="19"/>
+              </w:rPr>
+              <w:t>exports.deleteOne = (Model) =&gt;</w:t>
+              <w:br/>
+            </w:r>
+            <w:r>
+              <w:rPr>
+                <w:rFonts w:ascii="Consolas" w:hAnsi="Consolas"/>
+                <w:color w:val="1E293B"/>
+                <w:sz w:val="19"/>
+              </w:rPr>
+              <w:t xml:space="preserve">  catchAsync(async (req, res, next) =&gt; {</w:t>
+              <w:br/>
+            </w:r>
+            <w:r>
+              <w:rPr>
+                <w:rFonts w:ascii="Consolas" w:hAnsi="Consolas"/>
+                <w:color w:val="1E293B"/>
+                <w:sz w:val="19"/>
+              </w:rPr>
+              <w:t xml:space="preserve">    const doc = await Model.findByIdAndDelete(req.params.id);</w:t>
+              <w:br/>
+            </w:r>
+            <w:r>
+              <w:rPr>
+                <w:rFonts w:ascii="Consolas" w:hAnsi="Consolas"/>
+                <w:color w:val="1E293B"/>
+                <w:sz w:val="19"/>
+              </w:rPr>
+              <w:br/>
+            </w:r>
+            <w:r>
+              <w:rPr>
+                <w:rFonts w:ascii="Consolas" w:hAnsi="Consolas"/>
+                <w:color w:val="1E293B"/>
+                <w:sz w:val="19"/>
+              </w:rPr>
+              <w:t xml:space="preserve">    if (!doc) {</w:t>
+              <w:br/>
+            </w:r>
+            <w:r>
+              <w:rPr>
+                <w:rFonts w:ascii="Consolas" w:hAnsi="Consolas"/>
+                <w:color w:val="1E293B"/>
+                <w:sz w:val="19"/>
+              </w:rPr>
+              <w:t xml:space="preserve">      return next(new AppError(404, 'No document found with that ID'));</w:t>
+              <w:br/>
+            </w:r>
+            <w:r>
+              <w:rPr>
+                <w:rFonts w:ascii="Consolas" w:hAnsi="Consolas"/>
+                <w:color w:val="1E293B"/>
+                <w:sz w:val="19"/>
+              </w:rPr>
+              <w:t xml:space="preserve">    }</w:t>
+              <w:br/>
+            </w:r>
+            <w:r>
+              <w:rPr>
+                <w:rFonts w:ascii="Consolas" w:hAnsi="Consolas"/>
+                <w:color w:val="1E293B"/>
+                <w:sz w:val="19"/>
+              </w:rPr>
+              <w:br/>
+            </w:r>
+            <w:r>
+              <w:rPr>
+                <w:rFonts w:ascii="Consolas" w:hAnsi="Consolas"/>
+                <w:color w:val="1E293B"/>
+                <w:sz w:val="19"/>
+              </w:rPr>
+              <w:t xml:space="preserve">    res.status(204).json({</w:t>
+              <w:br/>
+            </w:r>
+            <w:r>
+              <w:rPr>
+                <w:rFonts w:ascii="Consolas" w:hAnsi="Consolas"/>
+                <w:color w:val="1E293B"/>
+                <w:sz w:val="19"/>
+              </w:rPr>
+              <w:t xml:space="preserve">      status: 'success',</w:t>
+              <w:br/>
+            </w:r>
+            <w:r>
+              <w:rPr>
+                <w:rFonts w:ascii="Consolas" w:hAnsi="Consolas"/>
+                <w:color w:val="1E293B"/>
+                <w:sz w:val="19"/>
+              </w:rPr>
+              <w:t xml:space="preserve">      data: null,</w:t>
+              <w:br/>
+            </w:r>
+            <w:r>
+              <w:rPr>
+                <w:rFonts w:ascii="Consolas" w:hAnsi="Consolas"/>
+                <w:color w:val="1E293B"/>
+                <w:sz w:val="19"/>
+              </w:rPr>
+              <w:t xml:space="preserve">    });</w:t>
+              <w:br/>
+            </w:r>
+            <w:r>
+              <w:rPr>
+                <w:rFonts w:ascii="Consolas" w:hAnsi="Consolas"/>
+                <w:color w:val="1E293B"/>
+                <w:sz w:val="19"/>
+              </w:rPr>
+              <w:t xml:space="preserve">  });</w:t>
+              <w:br/>
+            </w:r>
+            <w:r>
+              <w:rPr>
+                <w:rFonts w:ascii="Consolas" w:hAnsi="Consolas"/>
+                <w:color w:val="1E293B"/>
+                <w:sz w:val="19"/>
+              </w:rPr>
+              <w:br/>
+            </w:r>
+            <w:r>
+              <w:rPr>
+                <w:rFonts w:ascii="Consolas" w:hAnsi="Consolas"/>
+                <w:color w:val="1E293B"/>
+                <w:sz w:val="19"/>
+              </w:rPr>
+              <w:t>// 2. UPDATE ONE FACTORY</w:t>
+              <w:br/>
+            </w:r>
+            <w:r>
+              <w:rPr>
+                <w:rFonts w:ascii="Consolas" w:hAnsi="Consolas"/>
+                <w:color w:val="1E293B"/>
+                <w:sz w:val="19"/>
+              </w:rPr>
+              <w:t>exports.updateOne = (Model) =&gt;</w:t>
+              <w:br/>
+            </w:r>
+            <w:r>
+              <w:rPr>
+                <w:rFonts w:ascii="Consolas" w:hAnsi="Consolas"/>
+                <w:color w:val="1E293B"/>
+                <w:sz w:val="19"/>
+              </w:rPr>
+              <w:t xml:space="preserve">  catchAsync(async (req, res, next) =&gt; {</w:t>
+              <w:br/>
+            </w:r>
+            <w:r>
+              <w:rPr>
+                <w:rFonts w:ascii="Consolas" w:hAnsi="Consolas"/>
+                <w:color w:val="1E293B"/>
+                <w:sz w:val="19"/>
+              </w:rPr>
+              <w:t xml:space="preserve">    const doc = await Model.findByIdAndUpdate(req.params.id, req.body, {</w:t>
+              <w:br/>
+            </w:r>
+            <w:r>
+              <w:rPr>
+                <w:rFonts w:ascii="Consolas" w:hAnsi="Consolas"/>
+                <w:color w:val="1E293B"/>
+                <w:sz w:val="19"/>
+              </w:rPr>
+              <w:t xml:space="preserve">      new: true,</w:t>
+              <w:br/>
+            </w:r>
+            <w:r>
+              <w:rPr>
+                <w:rFonts w:ascii="Consolas" w:hAnsi="Consolas"/>
+                <w:color w:val="1E293B"/>
+                <w:sz w:val="19"/>
+              </w:rPr>
+              <w:t xml:space="preserve">      runValidators: true,</w:t>
+              <w:br/>
+            </w:r>
+            <w:r>
+              <w:rPr>
+                <w:rFonts w:ascii="Consolas" w:hAnsi="Consolas"/>
+                <w:color w:val="1E293B"/>
+                <w:sz w:val="19"/>
+              </w:rPr>
+              <w:t xml:space="preserve">    });</w:t>
+              <w:br/>
+            </w:r>
+            <w:r>
+              <w:rPr>
+                <w:rFonts w:ascii="Consolas" w:hAnsi="Consolas"/>
+                <w:color w:val="1E293B"/>
+                <w:sz w:val="19"/>
+              </w:rPr>
+              <w:br/>
+            </w:r>
+            <w:r>
+              <w:rPr>
+                <w:rFonts w:ascii="Consolas" w:hAnsi="Consolas"/>
+                <w:color w:val="1E293B"/>
+                <w:sz w:val="19"/>
+              </w:rPr>
+              <w:t xml:space="preserve">    if (!doc) {</w:t>
+              <w:br/>
+            </w:r>
+            <w:r>
+              <w:rPr>
+                <w:rFonts w:ascii="Consolas" w:hAnsi="Consolas"/>
+                <w:color w:val="1E293B"/>
+                <w:sz w:val="19"/>
+              </w:rPr>
+              <w:t xml:space="preserve">      return next(new AppError(404, 'No document found with that ID'));</w:t>
+              <w:br/>
+            </w:r>
+            <w:r>
+              <w:rPr>
+                <w:rFonts w:ascii="Consolas" w:hAnsi="Consolas"/>
+                <w:color w:val="1E293B"/>
+                <w:sz w:val="19"/>
+              </w:rPr>
+              <w:t xml:space="preserve">    }</w:t>
+              <w:br/>
+            </w:r>
+            <w:r>
+              <w:rPr>
+                <w:rFonts w:ascii="Consolas" w:hAnsi="Consolas"/>
+                <w:color w:val="1E293B"/>
+                <w:sz w:val="19"/>
+              </w:rPr>
+              <w:br/>
+            </w:r>
+            <w:r>
+              <w:rPr>
+                <w:rFonts w:ascii="Consolas" w:hAnsi="Consolas"/>
+                <w:color w:val="1E293B"/>
+                <w:sz w:val="19"/>
+              </w:rPr>
+              <w:t xml:space="preserve">    res.status(200).json({</w:t>
+              <w:br/>
+            </w:r>
+            <w:r>
+              <w:rPr>
+                <w:rFonts w:ascii="Consolas" w:hAnsi="Consolas"/>
+                <w:color w:val="1E293B"/>
+                <w:sz w:val="19"/>
+              </w:rPr>
+              <w:t xml:space="preserve">      status: 'success',</w:t>
+              <w:br/>
+            </w:r>
+            <w:r>
+              <w:rPr>
+                <w:rFonts w:ascii="Consolas" w:hAnsi="Consolas"/>
+                <w:color w:val="1E293B"/>
+                <w:sz w:val="19"/>
+              </w:rPr>
+              <w:t xml:space="preserve">      data: {</w:t>
+              <w:br/>
+            </w:r>
+            <w:r>
+              <w:rPr>
+                <w:rFonts w:ascii="Consolas" w:hAnsi="Consolas"/>
+                <w:color w:val="1E293B"/>
+                <w:sz w:val="19"/>
+              </w:rPr>
+              <w:t xml:space="preserve">        data: doc,</w:t>
+              <w:br/>
+            </w:r>
+            <w:r>
+              <w:rPr>
+                <w:rFonts w:ascii="Consolas" w:hAnsi="Consolas"/>
+                <w:color w:val="1E293B"/>
+                <w:sz w:val="19"/>
+              </w:rPr>
+              <w:t xml:space="preserve">      },</w:t>
+              <w:br/>
+            </w:r>
+            <w:r>
+              <w:rPr>
+                <w:rFonts w:ascii="Consolas" w:hAnsi="Consolas"/>
+                <w:color w:val="1E293B"/>
+                <w:sz w:val="19"/>
+              </w:rPr>
+              <w:t xml:space="preserve">    });</w:t>
+              <w:br/>
+            </w:r>
+            <w:r>
+              <w:rPr>
+                <w:rFonts w:ascii="Consolas" w:hAnsi="Consolas"/>
+                <w:color w:val="1E293B"/>
+                <w:sz w:val="19"/>
+              </w:rPr>
+              <w:t xml:space="preserve">  });</w:t>
+              <w:br/>
+            </w:r>
+            <w:r>
+              <w:rPr>
+                <w:rFonts w:ascii="Consolas" w:hAnsi="Consolas"/>
+                <w:color w:val="1E293B"/>
+                <w:sz w:val="19"/>
+              </w:rPr>
+              <w:br/>
+            </w:r>
+            <w:r>
+              <w:rPr>
+                <w:rFonts w:ascii="Consolas" w:hAnsi="Consolas"/>
+                <w:color w:val="1E293B"/>
+                <w:sz w:val="19"/>
+              </w:rPr>
+              <w:t>// 3. CREATE ONE FACTORY</w:t>
+              <w:br/>
+            </w:r>
+            <w:r>
+              <w:rPr>
+                <w:rFonts w:ascii="Consolas" w:hAnsi="Consolas"/>
+                <w:color w:val="1E293B"/>
+                <w:sz w:val="19"/>
+              </w:rPr>
+              <w:t>exports.createOne = (Model) =&gt;</w:t>
+              <w:br/>
+            </w:r>
+            <w:r>
+              <w:rPr>
+                <w:rFonts w:ascii="Consolas" w:hAnsi="Consolas"/>
+                <w:color w:val="1E293B"/>
+                <w:sz w:val="19"/>
+              </w:rPr>
+              <w:t xml:space="preserve">  catchAsync(async (req, res, next) =&gt; {</w:t>
+              <w:br/>
+            </w:r>
+            <w:r>
+              <w:rPr>
+                <w:rFonts w:ascii="Consolas" w:hAnsi="Consolas"/>
+                <w:color w:val="1E293B"/>
+                <w:sz w:val="19"/>
+              </w:rPr>
+              <w:t xml:space="preserve">    const doc = await Model.create(req.body);</w:t>
+              <w:br/>
+            </w:r>
+            <w:r>
+              <w:rPr>
+                <w:rFonts w:ascii="Consolas" w:hAnsi="Consolas"/>
+                <w:color w:val="1E293B"/>
+                <w:sz w:val="19"/>
+              </w:rPr>
+              <w:br/>
+            </w:r>
+            <w:r>
+              <w:rPr>
+                <w:rFonts w:ascii="Consolas" w:hAnsi="Consolas"/>
+                <w:color w:val="1E293B"/>
+                <w:sz w:val="19"/>
+              </w:rPr>
+              <w:t xml:space="preserve">    res.status(201).json({</w:t>
+              <w:br/>
+            </w:r>
+            <w:r>
+              <w:rPr>
+                <w:rFonts w:ascii="Consolas" w:hAnsi="Consolas"/>
+                <w:color w:val="1E293B"/>
+                <w:sz w:val="19"/>
+              </w:rPr>
+              <w:t xml:space="preserve">      status: 'success',</w:t>
+              <w:br/>
+            </w:r>
+            <w:r>
+              <w:rPr>
+                <w:rFonts w:ascii="Consolas" w:hAnsi="Consolas"/>
+                <w:color w:val="1E293B"/>
+                <w:sz w:val="19"/>
+              </w:rPr>
+              <w:t xml:space="preserve">      data: {</w:t>
+              <w:br/>
+            </w:r>
+            <w:r>
+              <w:rPr>
+                <w:rFonts w:ascii="Consolas" w:hAnsi="Consolas"/>
+                <w:color w:val="1E293B"/>
+                <w:sz w:val="19"/>
+              </w:rPr>
+              <w:t xml:space="preserve">        data: doc,</w:t>
+              <w:br/>
+            </w:r>
+            <w:r>
+              <w:rPr>
+                <w:rFonts w:ascii="Consolas" w:hAnsi="Consolas"/>
+                <w:color w:val="1E293B"/>
+                <w:sz w:val="19"/>
+              </w:rPr>
+              <w:t xml:space="preserve">      },</w:t>
+              <w:br/>
+            </w:r>
+            <w:r>
+              <w:rPr>
+                <w:rFonts w:ascii="Consolas" w:hAnsi="Consolas"/>
+                <w:color w:val="1E293B"/>
+                <w:sz w:val="19"/>
+              </w:rPr>
+              <w:t xml:space="preserve">    });</w:t>
+              <w:br/>
+            </w:r>
+            <w:r>
+              <w:rPr>
+                <w:rFonts w:ascii="Consolas" w:hAnsi="Consolas"/>
+                <w:color w:val="1E293B"/>
+                <w:sz w:val="19"/>
+              </w:rPr>
+              <w:t xml:space="preserve">  });</w:t>
+              <w:br/>
+            </w:r>
+            <w:r>
+              <w:rPr>
+                <w:rFonts w:ascii="Consolas" w:hAnsi="Consolas"/>
+                <w:color w:val="1E293B"/>
+                <w:sz w:val="19"/>
+              </w:rPr>
+              <w:br/>
+            </w:r>
+            <w:r>
+              <w:rPr>
+                <w:rFonts w:ascii="Consolas" w:hAnsi="Consolas"/>
+                <w:color w:val="1E293B"/>
+                <w:sz w:val="19"/>
+              </w:rPr>
+              <w:t>// 4. GET ONE FACTORY (Supports optional .populate())</w:t>
+              <w:br/>
+            </w:r>
+            <w:r>
+              <w:rPr>
+                <w:rFonts w:ascii="Consolas" w:hAnsi="Consolas"/>
+                <w:color w:val="1E293B"/>
+                <w:sz w:val="19"/>
+              </w:rPr>
+              <w:t>exports.getOne = (Model, popOptions) =&gt;</w:t>
+              <w:br/>
+            </w:r>
+            <w:r>
+              <w:rPr>
+                <w:rFonts w:ascii="Consolas" w:hAnsi="Consolas"/>
+                <w:color w:val="1E293B"/>
+                <w:sz w:val="19"/>
+              </w:rPr>
+              <w:t xml:space="preserve">  catchAsync(async (req, res, next) =&gt; {</w:t>
+              <w:br/>
+            </w:r>
+            <w:r>
+              <w:rPr>
+                <w:rFonts w:ascii="Consolas" w:hAnsi="Consolas"/>
+                <w:color w:val="1E293B"/>
+                <w:sz w:val="19"/>
+              </w:rPr>
+              <w:t xml:space="preserve">    let query = Model.findById(req.params.id);</w:t>
+              <w:br/>
+            </w:r>
+            <w:r>
+              <w:rPr>
+                <w:rFonts w:ascii="Consolas" w:hAnsi="Consolas"/>
+                <w:color w:val="1E293B"/>
+                <w:sz w:val="19"/>
+              </w:rPr>
+              <w:t xml:space="preserve">    if (popOptions) query = query.populate(popOptions);</w:t>
+              <w:br/>
+            </w:r>
+            <w:r>
+              <w:rPr>
+                <w:rFonts w:ascii="Consolas" w:hAnsi="Consolas"/>
+                <w:color w:val="1E293B"/>
+                <w:sz w:val="19"/>
+              </w:rPr>
+              <w:br/>
+            </w:r>
+            <w:r>
+              <w:rPr>
+                <w:rFonts w:ascii="Consolas" w:hAnsi="Consolas"/>
+                <w:color w:val="1E293B"/>
+                <w:sz w:val="19"/>
+              </w:rPr>
+              <w:t xml:space="preserve">    const doc = await query;</w:t>
+              <w:br/>
+            </w:r>
+            <w:r>
+              <w:rPr>
+                <w:rFonts w:ascii="Consolas" w:hAnsi="Consolas"/>
+                <w:color w:val="1E293B"/>
+                <w:sz w:val="19"/>
+              </w:rPr>
+              <w:br/>
+            </w:r>
+            <w:r>
+              <w:rPr>
+                <w:rFonts w:ascii="Consolas" w:hAnsi="Consolas"/>
+                <w:color w:val="1E293B"/>
+                <w:sz w:val="19"/>
+              </w:rPr>
+              <w:t xml:space="preserve">    if (!doc) {</w:t>
+              <w:br/>
+            </w:r>
+            <w:r>
+              <w:rPr>
+                <w:rFonts w:ascii="Consolas" w:hAnsi="Consolas"/>
+                <w:color w:val="1E293B"/>
+                <w:sz w:val="19"/>
+              </w:rPr>
+              <w:t xml:space="preserve">      return next(new AppError(404, 'No document found with that ID'));</w:t>
+              <w:br/>
+            </w:r>
+            <w:r>
+              <w:rPr>
+                <w:rFonts w:ascii="Consolas" w:hAnsi="Consolas"/>
+                <w:color w:val="1E293B"/>
+                <w:sz w:val="19"/>
+              </w:rPr>
+              <w:t xml:space="preserve">    }</w:t>
+              <w:br/>
+            </w:r>
+            <w:r>
+              <w:rPr>
+                <w:rFonts w:ascii="Consolas" w:hAnsi="Consolas"/>
+                <w:color w:val="1E293B"/>
+                <w:sz w:val="19"/>
+              </w:rPr>
+              <w:br/>
+            </w:r>
+            <w:r>
+              <w:rPr>
+                <w:rFonts w:ascii="Consolas" w:hAnsi="Consolas"/>
+                <w:color w:val="1E293B"/>
+                <w:sz w:val="19"/>
+              </w:rPr>
+              <w:t xml:space="preserve">    res.status(200).json({</w:t>
+              <w:br/>
+            </w:r>
+            <w:r>
+              <w:rPr>
+                <w:rFonts w:ascii="Consolas" w:hAnsi="Consolas"/>
+                <w:color w:val="1E293B"/>
+                <w:sz w:val="19"/>
+              </w:rPr>
+              <w:t xml:space="preserve">      status: 'success',</w:t>
+              <w:br/>
+            </w:r>
+            <w:r>
+              <w:rPr>
+                <w:rFonts w:ascii="Consolas" w:hAnsi="Consolas"/>
+                <w:color w:val="1E293B"/>
+                <w:sz w:val="19"/>
+              </w:rPr>
+              <w:t xml:space="preserve">      data: {</w:t>
+              <w:br/>
+            </w:r>
+            <w:r>
+              <w:rPr>
+                <w:rFonts w:ascii="Consolas" w:hAnsi="Consolas"/>
+                <w:color w:val="1E293B"/>
+                <w:sz w:val="19"/>
+              </w:rPr>
+              <w:t xml:space="preserve">        data: doc,</w:t>
+              <w:br/>
+            </w:r>
+            <w:r>
+              <w:rPr>
+                <w:rFonts w:ascii="Consolas" w:hAnsi="Consolas"/>
+                <w:color w:val="1E293B"/>
+                <w:sz w:val="19"/>
+              </w:rPr>
+              <w:t xml:space="preserve">      },</w:t>
+              <w:br/>
+            </w:r>
+            <w:r>
+              <w:rPr>
+                <w:rFonts w:ascii="Consolas" w:hAnsi="Consolas"/>
+                <w:color w:val="1E293B"/>
+                <w:sz w:val="19"/>
+              </w:rPr>
+              <w:t xml:space="preserve">    });</w:t>
+              <w:br/>
+            </w:r>
+            <w:r>
+              <w:rPr>
+                <w:rFonts w:ascii="Consolas" w:hAnsi="Consolas"/>
+                <w:color w:val="1E293B"/>
+                <w:sz w:val="19"/>
+              </w:rPr>
+              <w:t xml:space="preserve">  });</w:t>
+              <w:br/>
+            </w:r>
+            <w:r>
+              <w:rPr>
+                <w:rFonts w:ascii="Consolas" w:hAnsi="Consolas"/>
+                <w:color w:val="1E293B"/>
+                <w:sz w:val="19"/>
+              </w:rPr>
+              <w:br/>
+            </w:r>
+            <w:r>
+              <w:rPr>
+                <w:rFonts w:ascii="Consolas" w:hAnsi="Consolas"/>
+                <w:color w:val="1E293B"/>
+                <w:sz w:val="19"/>
+              </w:rPr>
+              <w:t>// 5. GET ALL FACTORY (Supports nested filtering &amp; APIFeatures)</w:t>
+              <w:br/>
+            </w:r>
+            <w:r>
+              <w:rPr>
+                <w:rFonts w:ascii="Consolas" w:hAnsi="Consolas"/>
+                <w:color w:val="1E293B"/>
+                <w:sz w:val="19"/>
+              </w:rPr>
+              <w:t>exports.getAll = (Model) =&gt;</w:t>
+              <w:br/>
+            </w:r>
+            <w:r>
+              <w:rPr>
+                <w:rFonts w:ascii="Consolas" w:hAnsi="Consolas"/>
+                <w:color w:val="1E293B"/>
+                <w:sz w:val="19"/>
+              </w:rPr>
+              <w:t xml:space="preserve">  catchAsync(async (req, res, next) =&gt; {</w:t>
+              <w:br/>
+            </w:r>
+            <w:r>
+              <w:rPr>
+                <w:rFonts w:ascii="Consolas" w:hAnsi="Consolas"/>
+                <w:color w:val="1E293B"/>
+                <w:sz w:val="19"/>
+              </w:rPr>
+              <w:t xml:space="preserve">    // To allow for nested GET reviews on tour (e.g. /tours/:tourId/reviews)</w:t>
+              <w:br/>
+            </w:r>
+            <w:r>
+              <w:rPr>
+                <w:rFonts w:ascii="Consolas" w:hAnsi="Consolas"/>
+                <w:color w:val="1E293B"/>
+                <w:sz w:val="19"/>
+              </w:rPr>
+              <w:t xml:space="preserve">    let filter = {};</w:t>
+              <w:br/>
+            </w:r>
+            <w:r>
+              <w:rPr>
+                <w:rFonts w:ascii="Consolas" w:hAnsi="Consolas"/>
+                <w:color w:val="1E293B"/>
+                <w:sz w:val="19"/>
+              </w:rPr>
+              <w:t xml:space="preserve">    if (req.params.tourId) filter = { tour: req.params.tourId };</w:t>
+              <w:br/>
+            </w:r>
+            <w:r>
+              <w:rPr>
+                <w:rFonts w:ascii="Consolas" w:hAnsi="Consolas"/>
+                <w:color w:val="1E293B"/>
+                <w:sz w:val="19"/>
+              </w:rPr>
+              <w:br/>
+            </w:r>
+            <w:r>
+              <w:rPr>
+                <w:rFonts w:ascii="Consolas" w:hAnsi="Consolas"/>
+                <w:color w:val="1E293B"/>
+                <w:sz w:val="19"/>
+              </w:rPr>
+              <w:t xml:space="preserve">    const features = new APIFeatures(Model.find(filter), req.query)</w:t>
+              <w:br/>
+            </w:r>
+            <w:r>
+              <w:rPr>
+                <w:rFonts w:ascii="Consolas" w:hAnsi="Consolas"/>
+                <w:color w:val="1E293B"/>
+                <w:sz w:val="19"/>
+              </w:rPr>
+              <w:t xml:space="preserve">      .filter()</w:t>
+              <w:br/>
+            </w:r>
+            <w:r>
+              <w:rPr>
+                <w:rFonts w:ascii="Consolas" w:hAnsi="Consolas"/>
+                <w:color w:val="1E293B"/>
+                <w:sz w:val="19"/>
+              </w:rPr>
+              <w:t xml:space="preserve">      .sort()</w:t>
+              <w:br/>
+            </w:r>
+            <w:r>
+              <w:rPr>
+                <w:rFonts w:ascii="Consolas" w:hAnsi="Consolas"/>
+                <w:color w:val="1E293B"/>
+                <w:sz w:val="19"/>
+              </w:rPr>
+              <w:t xml:space="preserve">      .limitFields()</w:t>
+              <w:br/>
+            </w:r>
+            <w:r>
+              <w:rPr>
+                <w:rFonts w:ascii="Consolas" w:hAnsi="Consolas"/>
+                <w:color w:val="1E293B"/>
+                <w:sz w:val="19"/>
+              </w:rPr>
+              <w:t xml:space="preserve">      .paginate();</w:t>
+              <w:br/>
+            </w:r>
+            <w:r>
+              <w:rPr>
+                <w:rFonts w:ascii="Consolas" w:hAnsi="Consolas"/>
+                <w:color w:val="1E293B"/>
+                <w:sz w:val="19"/>
+              </w:rPr>
+              <w:br/>
+            </w:r>
+            <w:r>
+              <w:rPr>
+                <w:rFonts w:ascii="Consolas" w:hAnsi="Consolas"/>
+                <w:color w:val="1E293B"/>
+                <w:sz w:val="19"/>
+              </w:rPr>
+              <w:t xml:space="preserve">    const docs = await features.query;</w:t>
+              <w:br/>
+            </w:r>
+            <w:r>
+              <w:rPr>
+                <w:rFonts w:ascii="Consolas" w:hAnsi="Consolas"/>
+                <w:color w:val="1E293B"/>
+                <w:sz w:val="19"/>
+              </w:rPr>
+              <w:br/>
+            </w:r>
+            <w:r>
+              <w:rPr>
+                <w:rFonts w:ascii="Consolas" w:hAnsi="Consolas"/>
+                <w:color w:val="1E293B"/>
+                <w:sz w:val="19"/>
+              </w:rPr>
+              <w:t xml:space="preserve">    res.status(200).json({</w:t>
+              <w:br/>
+            </w:r>
+            <w:r>
+              <w:rPr>
+                <w:rFonts w:ascii="Consolas" w:hAnsi="Consolas"/>
+                <w:color w:val="1E293B"/>
+                <w:sz w:val="19"/>
+              </w:rPr>
+              <w:t xml:space="preserve">      status: 'success',</w:t>
+              <w:br/>
+            </w:r>
+            <w:r>
+              <w:rPr>
+                <w:rFonts w:ascii="Consolas" w:hAnsi="Consolas"/>
+                <w:color w:val="1E293B"/>
+                <w:sz w:val="19"/>
+              </w:rPr>
+              <w:t xml:space="preserve">      results: docs.length,</w:t>
+              <w:br/>
+            </w:r>
+            <w:r>
+              <w:rPr>
+                <w:rFonts w:ascii="Consolas" w:hAnsi="Consolas"/>
+                <w:color w:val="1E293B"/>
+                <w:sz w:val="19"/>
+              </w:rPr>
+              <w:t xml:space="preserve">      data: {</w:t>
+              <w:br/>
+            </w:r>
+            <w:r>
+              <w:rPr>
+                <w:rFonts w:ascii="Consolas" w:hAnsi="Consolas"/>
+                <w:color w:val="1E293B"/>
+                <w:sz w:val="19"/>
+              </w:rPr>
+              <w:t xml:space="preserve">        data: docs,</w:t>
+              <w:br/>
+            </w:r>
+            <w:r>
+              <w:rPr>
+                <w:rFonts w:ascii="Consolas" w:hAnsi="Consolas"/>
+                <w:color w:val="1E293B"/>
+                <w:sz w:val="19"/>
+              </w:rPr>
+              <w:t xml:space="preserve">      },</w:t>
+              <w:br/>
+            </w:r>
+            <w:r>
+              <w:rPr>
+                <w:rFonts w:ascii="Consolas" w:hAnsi="Consolas"/>
+                <w:color w:val="1E293B"/>
+                <w:sz w:val="19"/>
+              </w:rPr>
+              <w:t xml:space="preserve">    });</w:t>
+              <w:br/>
+            </w:r>
+            <w:r>
+              <w:rPr>
+                <w:rFonts w:ascii="Consolas" w:hAnsi="Consolas"/>
+                <w:color w:val="1E293B"/>
+                <w:sz w:val="19"/>
+              </w:rPr>
+              <w:t xml:space="preserve">  });</w:t>
+            </w:r>
+          </w:p>
+        </w:tc>
+      </w:tr>
+    </w:tbl>
+    <w:p>
+      <w:pPr>
+        <w:spacing w:before="40" w:after="120"/>
+      </w:pPr>
+    </w:p>
+    <w:p>
+      <w:pPr>
+        <w:pStyle w:val="Heading2"/>
+        <w:spacing w:before="240" w:after="80"/>
+      </w:pPr>
+      <w:r>
+        <w:rPr>
+          <w:rFonts w:ascii="Calibri" w:hAnsi="Calibri"/>
+          <w:b/>
+          <w:color w:val="0F172A"/>
+          <w:sz w:val="26"/>
+        </w:rPr>
+        <w:t>Controller Transformation: Before vs. After</w:t>
+      </w:r>
+    </w:p>
+    <w:p>
+      <w:pPr>
+        <w:spacing w:before="40" w:after="120" w:line="276" w:lineRule="auto"/>
+      </w:pPr>
+      <w:r>
+        <w:rPr>
+          <w:rFonts w:ascii="Calibri" w:hAnsi="Calibri"/>
+          <w:b/>
+          <w:color w:val="0F172A"/>
+          <w:sz w:val="22"/>
+        </w:rPr>
+        <w:t xml:space="preserve">Clean Controller Architecture: </w:t>
+      </w:r>
+      <w:r>
+        <w:rPr>
+          <w:rFonts w:ascii="Calibri" w:hAnsi="Calibri"/>
+          <w:color w:val="334155"/>
+          <w:sz w:val="22"/>
+        </w:rPr>
+        <w:t>Notice how controllers like reviewController.js or tourController.js shrink from dozens of lines of repetitive boilerplate down to clean, single-line declarations:</w:t>
+      </w:r>
+    </w:p>
+    <w:tbl>
+      <w:tblPr>
+        <w:tblW w:type="auto" w:w="0"/>
+        <w:jc w:val="center"/>
+        <w:tblLayout w:type="fixed"/>
+        <w:tblLook w:firstColumn="1" w:firstRow="1" w:lastColumn="0" w:lastRow="0" w:noHBand="0" w:noVBand="1" w:val="04A0"/>
+      </w:tblPr>
+      <w:tblGrid>
+        <w:gridCol w:w="9936"/>
+      </w:tblGrid>
+      <w:tr>
+        <w:tc>
+          <w:tcPr>
+            <w:tcW w:type="dxa" w:w="9360"/>
+            <w:shd w:fill="F4F6F8"/>
+            <w:tcMar>
+              <w:top w:w="140" w:type="dxa"/>
+              <w:bottom w:w="140" w:type="dxa"/>
+              <w:left w:w="220" w:type="dxa"/>
+              <w:right w:w="220" w:type="dxa"/>
+            </w:tcMar>
+            <w:tcBorders>
+              <w:top w:val="single" w:sz="4" w:space="0" w:color="CBD5E1"/>
+              <w:bottom w:val="single" w:sz="4" w:space="0" w:color="CBD5E1"/>
+              <w:left w:val="single" w:sz="24" w:space="0" w:color="0284C7"/>
+              <w:right w:val="single" w:sz="4" w:space="0" w:color="CBD5E1"/>
+            </w:tcBorders>
+          </w:tcPr>
+          <w:p>
+            <w:pPr>
+              <w:spacing w:before="60" w:after="60" w:line="276" w:lineRule="auto"/>
+            </w:pPr>
+            <w:r>
+              <w:rPr>
+                <w:rFonts w:ascii="Consolas" w:hAnsi="Consolas"/>
+                <w:color w:val="1E293B"/>
+                <w:sz w:val="19"/>
+              </w:rPr>
+              <w:t>// controllers/reviewController.js (With Factory Pattern)</w:t>
+              <w:br/>
+            </w:r>
+            <w:r>
+              <w:rPr>
+                <w:rFonts w:ascii="Consolas" w:hAnsi="Consolas"/>
+                <w:color w:val="1E293B"/>
+                <w:sz w:val="19"/>
+              </w:rPr>
+              <w:t>const Review = require('../models/ReviewModel');</w:t>
+              <w:br/>
+            </w:r>
+            <w:r>
+              <w:rPr>
+                <w:rFonts w:ascii="Consolas" w:hAnsi="Consolas"/>
+                <w:color w:val="1E293B"/>
+                <w:sz w:val="19"/>
+              </w:rPr>
+              <w:t>const factory = require('./handlerFactory');</w:t>
+              <w:br/>
+            </w:r>
+            <w:r>
+              <w:rPr>
+                <w:rFonts w:ascii="Consolas" w:hAnsi="Consolas"/>
+                <w:color w:val="1E293B"/>
+                <w:sz w:val="19"/>
+              </w:rPr>
+              <w:br/>
+            </w:r>
+            <w:r>
+              <w:rPr>
+                <w:rFonts w:ascii="Consolas" w:hAnsi="Consolas"/>
+                <w:color w:val="1E293B"/>
+                <w:sz w:val="19"/>
+              </w:rPr>
+              <w:t>// Middleware to set Tour and User IDs from nested routes / protect middleware</w:t>
+              <w:br/>
+            </w:r>
+            <w:r>
+              <w:rPr>
+                <w:rFonts w:ascii="Consolas" w:hAnsi="Consolas"/>
+                <w:color w:val="1E293B"/>
+                <w:sz w:val="19"/>
+              </w:rPr>
+              <w:t>exports.setTourUserIds = (req, res, next) =&gt; {</w:t>
+              <w:br/>
+            </w:r>
+            <w:r>
+              <w:rPr>
+                <w:rFonts w:ascii="Consolas" w:hAnsi="Consolas"/>
+                <w:color w:val="1E293B"/>
+                <w:sz w:val="19"/>
+              </w:rPr>
+              <w:t xml:space="preserve">  if (!req.body.tour) req.body.tour = req.params.tourId;</w:t>
+              <w:br/>
+            </w:r>
+            <w:r>
+              <w:rPr>
+                <w:rFonts w:ascii="Consolas" w:hAnsi="Consolas"/>
+                <w:color w:val="1E293B"/>
+                <w:sz w:val="19"/>
+              </w:rPr>
+              <w:t xml:space="preserve">  if (!req.body.user) req.body.user = req.user.id;</w:t>
+              <w:br/>
+            </w:r>
+            <w:r>
+              <w:rPr>
+                <w:rFonts w:ascii="Consolas" w:hAnsi="Consolas"/>
+                <w:color w:val="1E293B"/>
+                <w:sz w:val="19"/>
+              </w:rPr>
+              <w:t xml:space="preserve">  next();</w:t>
+              <w:br/>
+            </w:r>
+            <w:r>
+              <w:rPr>
+                <w:rFonts w:ascii="Consolas" w:hAnsi="Consolas"/>
+                <w:color w:val="1E293B"/>
+                <w:sz w:val="19"/>
+              </w:rPr>
+              <w:t>};</w:t>
+              <w:br/>
+            </w:r>
+            <w:r>
+              <w:rPr>
+                <w:rFonts w:ascii="Consolas" w:hAnsi="Consolas"/>
+                <w:color w:val="1E293B"/>
+                <w:sz w:val="19"/>
+              </w:rPr>
+              <w:br/>
+            </w:r>
+            <w:r>
+              <w:rPr>
+                <w:rFonts w:ascii="Consolas" w:hAnsi="Consolas"/>
+                <w:color w:val="1E293B"/>
+                <w:sz w:val="19"/>
+              </w:rPr>
+              <w:t>// 1-line CRUD handlers generated by Factory:</w:t>
+              <w:br/>
+            </w:r>
+            <w:r>
+              <w:rPr>
+                <w:rFonts w:ascii="Consolas" w:hAnsi="Consolas"/>
+                <w:color w:val="1E293B"/>
+                <w:sz w:val="19"/>
+              </w:rPr>
+              <w:t>exports.getAllReviews = factory.getAll(Review);</w:t>
+              <w:br/>
+            </w:r>
+            <w:r>
+              <w:rPr>
+                <w:rFonts w:ascii="Consolas" w:hAnsi="Consolas"/>
+                <w:color w:val="1E293B"/>
+                <w:sz w:val="19"/>
+              </w:rPr>
+              <w:t>exports.getReviewById = factory.getOne(Review);</w:t>
+              <w:br/>
+            </w:r>
+            <w:r>
+              <w:rPr>
+                <w:rFonts w:ascii="Consolas" w:hAnsi="Consolas"/>
+                <w:color w:val="1E293B"/>
+                <w:sz w:val="19"/>
+              </w:rPr>
+              <w:t>exports.createReview = factory.createOne(Review);</w:t>
+              <w:br/>
+            </w:r>
+            <w:r>
+              <w:rPr>
+                <w:rFonts w:ascii="Consolas" w:hAnsi="Consolas"/>
+                <w:color w:val="1E293B"/>
+                <w:sz w:val="19"/>
+              </w:rPr>
+              <w:t>exports.updateReview = factory.updateOne(Review);</w:t>
+              <w:br/>
+            </w:r>
+            <w:r>
+              <w:rPr>
+                <w:rFonts w:ascii="Consolas" w:hAnsi="Consolas"/>
+                <w:color w:val="1E293B"/>
+                <w:sz w:val="19"/>
+              </w:rPr>
+              <w:t>exports.deleteReview = factory.deleteOne(Review);</w:t>
+            </w:r>
+          </w:p>
+        </w:tc>
+      </w:tr>
+    </w:tbl>
+    <w:p>
+      <w:pPr>
+        <w:spacing w:before="40" w:after="120"/>
+      </w:pPr>
+    </w:p>
+    <w:tbl>
+      <w:tblPr>
+        <w:tblW w:type="auto" w:w="0"/>
+        <w:jc w:val="center"/>
+        <w:tblLayout w:type="fixed"/>
+        <w:tblLook w:firstColumn="1" w:firstRow="1" w:lastColumn="0" w:lastRow="0" w:noHBand="0" w:noVBand="1" w:val="04A0"/>
+      </w:tblPr>
+      <w:tblGrid>
+        <w:gridCol w:w="9936"/>
+      </w:tblGrid>
+      <w:tr>
+        <w:tc>
+          <w:tcPr>
+            <w:tcW w:type="dxa" w:w="9360"/>
+            <w:shd w:fill="F4F6F8"/>
+            <w:tcMar>
+              <w:top w:w="140" w:type="dxa"/>
+              <w:bottom w:w="140" w:type="dxa"/>
+              <w:left w:w="220" w:type="dxa"/>
+              <w:right w:w="220" w:type="dxa"/>
+            </w:tcMar>
+            <w:tcBorders>
+              <w:top w:val="single" w:sz="4" w:space="0" w:color="CBD5E1"/>
+              <w:bottom w:val="single" w:sz="4" w:space="0" w:color="CBD5E1"/>
+              <w:left w:val="single" w:sz="24" w:space="0" w:color="0284C7"/>
+              <w:right w:val="single" w:sz="4" w:space="0" w:color="CBD5E1"/>
+            </w:tcBorders>
+          </w:tcPr>
+          <w:p>
+            <w:pPr>
+              <w:spacing w:before="60" w:after="60" w:line="276" w:lineRule="auto"/>
+            </w:pPr>
+            <w:r>
+              <w:rPr>
+                <w:rFonts w:ascii="Consolas" w:hAnsi="Consolas"/>
+                <w:color w:val="1E293B"/>
+                <w:sz w:val="19"/>
+              </w:rPr>
+              <w:t>// controllers/tourController.js (With Factory Pattern)</w:t>
+              <w:br/>
+            </w:r>
+            <w:r>
+              <w:rPr>
+                <w:rFonts w:ascii="Consolas" w:hAnsi="Consolas"/>
+                <w:color w:val="1E293B"/>
+                <w:sz w:val="19"/>
+              </w:rPr>
+              <w:t>const Tour = require('../models/TourModel');</w:t>
+              <w:br/>
+            </w:r>
+            <w:r>
+              <w:rPr>
+                <w:rFonts w:ascii="Consolas" w:hAnsi="Consolas"/>
+                <w:color w:val="1E293B"/>
+                <w:sz w:val="19"/>
+              </w:rPr>
+              <w:t>const factory = require('./handlerFactory');</w:t>
+              <w:br/>
+            </w:r>
+            <w:r>
+              <w:rPr>
+                <w:rFonts w:ascii="Consolas" w:hAnsi="Consolas"/>
+                <w:color w:val="1E293B"/>
+                <w:sz w:val="19"/>
+              </w:rPr>
+              <w:br/>
+            </w:r>
+            <w:r>
+              <w:rPr>
+                <w:rFonts w:ascii="Consolas" w:hAnsi="Consolas"/>
+                <w:color w:val="1E293B"/>
+                <w:sz w:val="19"/>
+              </w:rPr>
+              <w:t>// Factory CRUD handlers</w:t>
+              <w:br/>
+            </w:r>
+            <w:r>
+              <w:rPr>
+                <w:rFonts w:ascii="Consolas" w:hAnsi="Consolas"/>
+                <w:color w:val="1E293B"/>
+                <w:sz w:val="19"/>
+              </w:rPr>
+              <w:t>exports.getAllTours = factory.getAll(Tour);</w:t>
+              <w:br/>
+            </w:r>
+            <w:r>
+              <w:rPr>
+                <w:rFonts w:ascii="Consolas" w:hAnsi="Consolas"/>
+                <w:color w:val="1E293B"/>
+                <w:sz w:val="19"/>
+              </w:rPr>
+              <w:t>exports.getTourById = factory.getOne(Tour, { path: 'reviews', select: 'rating review user' });</w:t>
+              <w:br/>
+            </w:r>
+            <w:r>
+              <w:rPr>
+                <w:rFonts w:ascii="Consolas" w:hAnsi="Consolas"/>
+                <w:color w:val="1E293B"/>
+                <w:sz w:val="19"/>
+              </w:rPr>
+              <w:t>exports.createTour = factory.createOne(Tour);</w:t>
+              <w:br/>
+            </w:r>
+            <w:r>
+              <w:rPr>
+                <w:rFonts w:ascii="Consolas" w:hAnsi="Consolas"/>
+                <w:color w:val="1E293B"/>
+                <w:sz w:val="19"/>
+              </w:rPr>
+              <w:t>exports.updateTour = factory.updateOne(Tour);</w:t>
+              <w:br/>
+            </w:r>
+            <w:r>
+              <w:rPr>
+                <w:rFonts w:ascii="Consolas" w:hAnsi="Consolas"/>
+                <w:color w:val="1E293B"/>
+                <w:sz w:val="19"/>
+              </w:rPr>
+              <w:t>exports.deleteTour = factory.deleteOne(Tour);</w:t>
+              <w:br/>
+            </w:r>
+            <w:r>
+              <w:rPr>
+                <w:rFonts w:ascii="Consolas" w:hAnsi="Consolas"/>
+                <w:color w:val="1E293B"/>
+                <w:sz w:val="19"/>
+              </w:rPr>
+              <w:br/>
+            </w:r>
+            <w:r>
+              <w:rPr>
+                <w:rFonts w:ascii="Consolas" w:hAnsi="Consolas"/>
+                <w:color w:val="1E293B"/>
+                <w:sz w:val="19"/>
+              </w:rPr>
+              <w:t>// Custom Business Logic remains unique to this controller:</w:t>
+              <w:br/>
+            </w:r>
+            <w:r>
+              <w:rPr>
+                <w:rFonts w:ascii="Consolas" w:hAnsi="Consolas"/>
+                <w:color w:val="1E293B"/>
+                <w:sz w:val="19"/>
+              </w:rPr>
+              <w:t>exports.getCheapestRoutes = (req, res, next) =&gt; { ... };</w:t>
+              <w:br/>
+            </w:r>
+            <w:r>
+              <w:rPr>
+                <w:rFonts w:ascii="Consolas" w:hAnsi="Consolas"/>
+                <w:color w:val="1E293B"/>
+                <w:sz w:val="19"/>
+              </w:rPr>
+              <w:t>exports.getTourStats = catchAsync(async (req, res, next) =&gt; { ... });</w:t>
+              <w:br/>
+            </w:r>
+            <w:r>
+              <w:rPr>
+                <w:rFonts w:ascii="Consolas" w:hAnsi="Consolas"/>
+                <w:color w:val="1E293B"/>
+                <w:sz w:val="19"/>
+              </w:rPr>
+              <w:t>exports.getMonthlyPlan = catchAsync(async (req, res, next) =&gt; { ... });</w:t>
+            </w:r>
+          </w:p>
+        </w:tc>
+      </w:tr>
+    </w:tbl>
+    <w:p>
+      <w:pPr>
+        <w:spacing w:before="40" w:after="120"/>
+      </w:pPr>
+    </w:p>
+    <w:p>
+      <w:pPr>
+        <w:pStyle w:val="Heading2"/>
+        <w:spacing w:before="240" w:after="80"/>
+      </w:pPr>
+      <w:r>
+        <w:rPr>
+          <w:rFonts w:ascii="Calibri" w:hAnsi="Calibri"/>
+          <w:b/>
+          <w:color w:val="0F172A"/>
+          <w:sz w:val="26"/>
+        </w:rPr>
+        <w:t>Key Architectural Benefits &amp; Interview Summary</w:t>
+      </w:r>
+    </w:p>
+    <w:p>
+      <w:pPr>
+        <w:pStyle w:val="ListBullet"/>
+        <w:spacing w:before="40" w:after="80" w:line="276" w:lineRule="auto"/>
+      </w:pPr>
+      <w:r>
+        <w:rPr>
+          <w:rFonts w:ascii="Calibri" w:hAnsi="Calibri"/>
+          <w:b/>
+          <w:color w:val="0F172A"/>
+          <w:sz w:val="22"/>
+        </w:rPr>
+        <w:t xml:space="preserve">1. Maximum Code Reusability (DRY): </w:t>
+      </w:r>
+      <w:r>
+        <w:rPr>
+          <w:rFonts w:ascii="Calibri" w:hAnsi="Calibri"/>
+          <w:color w:val="334155"/>
+          <w:sz w:val="22"/>
+        </w:rPr>
+        <w:t>Eliminates ~70-80% of repetitive code across all CRUD resource controllers.</w:t>
+      </w:r>
+    </w:p>
+    <w:p>
+      <w:pPr>
+        <w:pStyle w:val="ListBullet"/>
+        <w:spacing w:before="40" w:after="80" w:line="276" w:lineRule="auto"/>
+      </w:pPr>
+      <w:r>
+        <w:rPr>
+          <w:rFonts w:ascii="Calibri" w:hAnsi="Calibri"/>
+          <w:b/>
+          <w:color w:val="0F172A"/>
+          <w:sz w:val="22"/>
+        </w:rPr>
+        <w:t xml:space="preserve">2. Single Source of Truth: </w:t>
+      </w:r>
+      <w:r>
+        <w:rPr>
+          <w:rFonts w:ascii="Calibri" w:hAnsi="Calibri"/>
+          <w:color w:val="334155"/>
+          <w:sz w:val="22"/>
+        </w:rPr>
+        <w:t>Any adjustment to API JSON response envelope structures, error formats, or query features happens in exactly one place.</w:t>
+      </w:r>
+    </w:p>
+    <w:p>
+      <w:pPr>
+        <w:pStyle w:val="ListBullet"/>
+        <w:spacing w:before="40" w:after="80" w:line="276" w:lineRule="auto"/>
+      </w:pPr>
+      <w:r>
+        <w:rPr>
+          <w:rFonts w:ascii="Calibri" w:hAnsi="Calibri"/>
+          <w:b/>
+          <w:color w:val="0F172A"/>
+          <w:sz w:val="22"/>
+        </w:rPr>
+        <w:t xml:space="preserve">3. Separation of Concerns: </w:t>
+      </w:r>
+      <w:r>
+        <w:rPr>
+          <w:rFonts w:ascii="Calibri" w:hAnsi="Calibri"/>
+          <w:color w:val="334155"/>
+          <w:sz w:val="22"/>
+        </w:rPr>
+        <w:t>Standard CRUD operations are decoupled from domain-specific business logic (e.g. statistics, geospatial queries, authentication), keeping individual controllers lean and readable.</w:t>
+      </w:r>
+    </w:p>
+    <w:p>
+      <w:pPr>
+        <w:pStyle w:val="ListBullet"/>
+        <w:spacing w:before="40" w:after="80" w:line="276" w:lineRule="auto"/>
+      </w:pPr>
+      <w:r>
+        <w:rPr>
+          <w:rFonts w:ascii="Calibri" w:hAnsi="Calibri"/>
+          <w:b/>
+          <w:color w:val="0F172A"/>
+          <w:sz w:val="22"/>
+        </w:rPr>
+        <w:t xml:space="preserve">4. Functional Programming Paradigm: </w:t>
+      </w:r>
+      <w:r>
+        <w:rPr>
+          <w:rFonts w:ascii="Calibri" w:hAnsi="Calibri"/>
+          <w:color w:val="334155"/>
+          <w:sz w:val="22"/>
+        </w:rPr>
+        <w:t>Demonstrates practical mastery of JavaScript closures, higher-order functions, and currying in Node.js backend development.</w:t>
+      </w:r>
+    </w:p>
     <w:sectPr>
       <w:pgSz w:w="12240" w:h="15840"/>
       <w:pgMar w:top="1152" w:right="1152" w:bottom="1152" w:left="1152" w:header="720" w:footer="720" w:gutter="0"/>

</xml_diff>